<commit_message>
docs: refresh Traffic-R design materials
</commit_message>
<xml_diff>
--- a/docs/traffic-r-algorithm-and-scaled-network-dispatch.docx
+++ b/docs/traffic-r-algorithm-and-scaled-network-dispatch.docx
@@ -13,7 +13,7 @@
           <w:color w:val="0B2545"/>
           <w:sz w:val="40"/>
         </w:rPr>
-        <w:t>Traffic-R ?????????????????</w:t>
+        <w:t>Traffic-R 云端算法实现与复杂路网混合调度方案</w:t>
       </w:r>
     </w:p>
     <w:p>
@@ -25,7 +25,7 @@
           <w:color w:val="555555"/>
           <w:sz w:val="20"/>
         </w:rPr>
-        <w:t>???? Spring Boot + Python CityFlow + Traffic-R ????????????????</w:t>
+        <w:t>面向当前 Spring Boot + Python CityFlow + Traffic-R 在线控制链路的实现说明与扩展设计</w:t>
       </w:r>
     </w:p>
     <w:p>
@@ -33,15 +33,12 @@
         <w:pStyle w:val="Heading1"/>
       </w:pPr>
       <w:r>
-        <w:t>1. ?????????</w:t>
+        <w:t>1. 文档目的与结论摘要</w:t>
       </w:r>
     </w:p>
     <w:p>
-      <w:pPr>
-        <w:spacing w:after="120" w:line="276" w:lineRule="auto"/>
-      </w:pPr>
       <w:r>
-        <w:t>??????????? Traffic-R ???????????????? Traffic-R1 ????????????????????????? Traffic-R?Max-Pressure?Fixed-Time ?????????????</w:t>
+        <w:t>本文解释当前后端中 Traffic-R 云端模型的在线推理链路、它与官方 Traffic-R1 算法思想之间的关系，以及在扩大路网复杂度时如何通过 Traffic-R、Max-Pressure、Fixed-Time 的混合控制保证调度稳定性。</w:t>
       </w:r>
     </w:p>
     <w:p>
@@ -49,7 +46,7 @@
         <w:pStyle w:val="ListBullet"/>
       </w:pPr>
       <w:r>
-        <w:t>???????????? RL ???????? CityFlow ??????? Traffic-R ?????????????????????? ControlDecision?</w:t>
+        <w:t>当前项目并未在后端内训练 RL 模型；后端负责把 CityFlow 实时状态转换成 Traffic-R 所需输入，调用云端模型推理，并把结果转成统一 ControlDecision。</w:t>
       </w:r>
     </w:p>
     <w:p>
@@ -57,7 +54,7 @@
         <w:pStyle w:val="ListBullet"/>
       </w:pPr>
       <w:r>
-        <w:t>Traffic-R1 ???????????? DQN/PPO/MAPPO ???????????????????????????????????????????????????????????????</w:t>
+        <w:t>Traffic-R1 的核心不是传统 DQN/PPO/MAPPO 那种固定状态维度的端到端控制器，而是基于大语言模型的两阶段强化学习：先学习交通信号控制的通用推理能力，再学习环境特定优化能力。</w:t>
       </w:r>
     </w:p>
     <w:p>
@@ -65,7 +62,7 @@
         <w:pStyle w:val="ListBullet"/>
       </w:pPr>
       <w:r>
-        <w:t>???????????Traffic-R core + MaxPressure boundary/complex + Fixed-Time low-flow???????????????????? Traffic-R?</w:t>
+        <w:t>扩大路网时，建议采用 “Traffic-R core + MaxPressure boundary/complex + Fixed-Time low-flow” 的混合策略，而不是把所有路口都强行交给 Traffic-R。</w:t>
       </w:r>
     </w:p>
     <w:p>
@@ -73,15 +70,12 @@
         <w:pStyle w:val="Heading1"/>
       </w:pPr>
       <w:r>
-        <w:t>2. ?? Traffic-R1 ????</w:t>
+        <w:t>2. 官方 Traffic-R1 算法核心</w:t>
       </w:r>
     </w:p>
     <w:p>
-      <w:pPr>
-        <w:spacing w:after="120" w:line="276" w:lineRule="auto"/>
-      </w:pPr>
       <w:r>
-        <w:t>?? Traffic-R1 ??????????Traffic-R1 ?????????TSC????????????????????????????????????????????????? RL ?????????????????????????????????????????Traffic-R1 ??? LLM ????????????????????</w:t>
+        <w:t>根据 Traffic-R1 官方论文与模型说明，Traffic-R1 面向交通信号控制任务，将大语言模型作为信号控制智能体，通过强化学习提升其对交通状态的理解与决策能力。论文强调传统 RL 控制器通常受限于状态空间和动作空间，迁移到不同路网、交通流和交叉口配置时成本较高；Traffic-R1 则利用 LLM 的推理与指令泛化能力，降低场景迁移成本。</w:t>
       </w:r>
     </w:p>
     <w:p>
@@ -89,7 +83,7 @@
         <w:pStyle w:val="Heading2"/>
       </w:pPr>
       <w:r>
-        <w:t>2.1 ???????</w:t>
+        <w:t>2.1 两阶段训练思想</w:t>
       </w:r>
     </w:p>
     <w:tbl>
@@ -108,61 +102,61 @@
       <w:tr>
         <w:tc>
           <w:tcPr>
-            <w:tcW w:type="dxa" w:w="2160"/>
+            <w:tcW w:type="dxa" w:w="1944"/>
+            <w:shd w:fill="E8EEF5"/>
             <w:vAlign w:val="center"/>
-            <w:shd w:fill="E8EEF5"/>
           </w:tcPr>
           <w:p>
             <w:r>
               <w:rPr>
                 <w:b/>
               </w:rPr>
-              <w:t>??</w:t>
+              <w:t>阶段</w:t>
             </w:r>
           </w:p>
         </w:tc>
         <w:tc>
           <w:tcPr>
-            <w:tcW w:type="dxa" w:w="2160"/>
+            <w:tcW w:type="dxa" w:w="2088"/>
+            <w:shd w:fill="E8EEF5"/>
             <w:vAlign w:val="center"/>
-            <w:shd w:fill="E8EEF5"/>
           </w:tcPr>
           <w:p>
             <w:r>
               <w:rPr>
                 <w:b/>
               </w:rPr>
-              <w:t>??</w:t>
+              <w:t>目标</w:t>
             </w:r>
           </w:p>
         </w:tc>
         <w:tc>
           <w:tcPr>
-            <w:tcW w:type="dxa" w:w="3456"/>
+            <w:tcW w:type="dxa" w:w="3888"/>
+            <w:shd w:fill="E8EEF5"/>
             <w:vAlign w:val="center"/>
-            <w:shd w:fill="E8EEF5"/>
           </w:tcPr>
           <w:p>
             <w:r>
               <w:rPr>
                 <w:b/>
               </w:rPr>
-              <w:t>????</w:t>
+              <w:t>算法逻辑</w:t>
             </w:r>
           </w:p>
         </w:tc>
         <w:tc>
           <w:tcPr>
-            <w:tcW w:type="dxa" w:w="1728"/>
+            <w:tcW w:type="dxa" w:w="1800"/>
+            <w:shd w:fill="E8EEF5"/>
             <w:vAlign w:val="center"/>
-            <w:shd w:fill="E8EEF5"/>
           </w:tcPr>
           <w:p>
             <w:r>
               <w:rPr>
                 <w:b/>
               </w:rPr>
-              <w:t>??</w:t>
+              <w:t>作用</w:t>
             </w:r>
           </w:p>
         </w:tc>
@@ -170,45 +164,45 @@
       <w:tr>
         <w:tc>
           <w:tcPr>
-            <w:tcW w:type="dxa" w:w="2160"/>
+            <w:tcW w:type="dxa" w:w="1944"/>
             <w:vAlign w:val="center"/>
           </w:tcPr>
           <w:p>
             <w:r>
-              <w:t>????????????</w:t>
+              <w:t>阶段一：通用交通推理能力</w:t>
             </w:r>
           </w:p>
         </w:tc>
         <w:tc>
           <w:tcPr>
-            <w:tcW w:type="dxa" w:w="2160"/>
+            <w:tcW w:type="dxa" w:w="2088"/>
             <w:vAlign w:val="center"/>
           </w:tcPr>
           <w:p>
             <w:r>
-              <w:t>?????????????????</w:t>
+              <w:t>学习交通信号控制中的一般规则和常识</w:t>
             </w:r>
           </w:p>
         </w:tc>
         <w:tc>
           <w:tcPr>
-            <w:tcW w:type="dxa" w:w="3456"/>
+            <w:tcW w:type="dxa" w:w="3888"/>
             <w:vAlign w:val="center"/>
           </w:tcPr>
           <w:p>
             <w:r>
-              <w:t>?? GRPO ???????????????????????????????????????????????</w:t>
+              <w:t>使用 GRPO 类强化学习，使模型形成“排队车辆优先、接近车辆次之、选择最有效相位”的推理模式</w:t>
             </w:r>
           </w:p>
         </w:tc>
         <w:tc>
           <w:tcPr>
-            <w:tcW w:type="dxa" w:w="1728"/>
+            <w:tcW w:type="dxa" w:w="1800"/>
             <w:vAlign w:val="center"/>
           </w:tcPr>
           <w:p>
             <w:r>
-              <w:t>????? zero-shot ????</w:t>
+              <w:t>获得跨场景 zero-shot 基础能力</w:t>
             </w:r>
           </w:p>
         </w:tc>
@@ -216,45 +210,45 @@
       <w:tr>
         <w:tc>
           <w:tcPr>
-            <w:tcW w:type="dxa" w:w="2160"/>
+            <w:tcW w:type="dxa" w:w="1944"/>
             <w:vAlign w:val="center"/>
           </w:tcPr>
           <w:p>
             <w:r>
-              <w:t>????????????</w:t>
+              <w:t>阶段二：环境特定优化能力</w:t>
             </w:r>
           </w:p>
         </w:tc>
         <w:tc>
           <w:tcPr>
-            <w:tcW w:type="dxa" w:w="2160"/>
+            <w:tcW w:type="dxa" w:w="2088"/>
             <w:vAlign w:val="center"/>
           </w:tcPr>
           <w:p>
             <w:r>
-              <w:t>?????????????</w:t>
+              <w:t>适应具体仿真环境和评价目标</w:t>
             </w:r>
           </w:p>
         </w:tc>
         <w:tc>
           <w:tcPr>
-            <w:tcW w:type="dxa" w:w="3456"/>
+            <w:tcW w:type="dxa" w:w="3888"/>
             <w:vAlign w:val="center"/>
           </w:tcPr>
           <w:p>
             <w:r>
-              <w:t>?? STPO ???/?????????????????????????</w:t>
+              <w:t>使用 STPO 类轨迹/环境反馈优化，让模型根据真实仿真结果进一步调整策略</w:t>
             </w:r>
           </w:p>
         </w:tc>
         <w:tc>
           <w:tcPr>
-            <w:tcW w:type="dxa" w:w="1728"/>
+            <w:tcW w:type="dxa" w:w="1800"/>
             <w:vAlign w:val="center"/>
           </w:tcPr>
           <w:p>
             <w:r>
-              <w:t>????????????????</w:t>
+              <w:t>提升指定场景中的通行效率和稳定性</w:t>
             </w:r>
           </w:p>
         </w:tc>
@@ -262,11 +256,8 @@
     </w:tbl>
     <w:p/>
     <w:p>
-      <w:pPr>
-        <w:spacing w:after="120" w:line="276" w:lineRule="auto"/>
-      </w:pPr>
       <w:r>
-        <w:t>????????????????????????????????????????????????????? RL ?????????????????????????/??? prompt?????????????????????????????????</w:t>
+        <w:t>从工程角度看，阶段一提供“可迁移的交通推理先验”，阶段二提供“对当前仿真环境的策略细化”。这也是它相比传统 RL 更适合做复杂系统扩展论证的关键：模型输入是自然语言/结构化 prompt，输出是可解释的相位选择，而不是只能绑定固定拓扑的神经网络动作头。</w:t>
       </w:r>
     </w:p>
     <w:p>
@@ -274,15 +265,12 @@
         <w:pStyle w:val="Heading2"/>
       </w:pPr>
       <w:r>
-        <w:t>2.2 ??????????</w:t>
+        <w:t>2.2 在线推理时的决策形式</w:t>
       </w:r>
     </w:p>
     <w:p>
-      <w:pPr>
-        <w:spacing w:after="120" w:line="276" w:lineRule="auto"/>
-      </w:pPr>
       <w:r>
-        <w:t>Traffic-R1 ????????????? CityFlow phase id????????????????????????????????? commonsense prompt ??????????????????????????????? movement lane?????????????????????????</w:t>
+        <w:t>Traffic-R1 在线控制并不是直接输出底层 CityFlow phase id，而是根据单个路口的交通状态选择一个候选信号相位。当前项目采用官方 commonsense prompt 风格：把十字路口抽象为东西南北四个方向，每个方向包含直行和左转 movement lane，并把车辆状态分为排队车辆与不同距离段的接近车辆。</w:t>
       </w:r>
     </w:p>
     <w:tbl>
@@ -301,45 +289,45 @@
         <w:tc>
           <w:tcPr>
             <w:tcW w:type="dxa" w:w="1440"/>
+            <w:shd w:fill="E8EEF5"/>
             <w:vAlign w:val="center"/>
-            <w:shd w:fill="E8EEF5"/>
           </w:tcPr>
           <w:p>
             <w:r>
               <w:rPr>
                 <w:b/>
               </w:rPr>
-              <w:t>????</w:t>
+              <w:t>相位编码</w:t>
             </w:r>
           </w:p>
         </w:tc>
         <w:tc>
           <w:tcPr>
             <w:tcW w:type="dxa" w:w="2592"/>
+            <w:shd w:fill="E8EEF5"/>
             <w:vAlign w:val="center"/>
-            <w:shd w:fill="E8EEF5"/>
           </w:tcPr>
           <w:p>
             <w:r>
               <w:rPr>
                 <w:b/>
               </w:rPr>
-              <w:t>??</w:t>
+              <w:t>含义</w:t>
             </w:r>
           </w:p>
         </w:tc>
         <w:tc>
           <w:tcPr>
             <w:tcW w:type="dxa" w:w="4320"/>
+            <w:shd w:fill="E8EEF5"/>
             <w:vAlign w:val="center"/>
-            <w:shd w:fill="E8EEF5"/>
           </w:tcPr>
           <w:p>
             <w:r>
               <w:rPr>
                 <w:b/>
               </w:rPr>
-              <w:t>?? movement</w:t>
+              <w:t>适用 movement</w:t>
             </w:r>
           </w:p>
         </w:tc>
@@ -363,7 +351,7 @@
           </w:tcPr>
           <w:p>
             <w:r>
-              <w:t>???????</w:t>
+              <w:t>东西向直行放行</w:t>
             </w:r>
           </w:p>
         </w:tc>
@@ -398,7 +386,7 @@
           </w:tcPr>
           <w:p>
             <w:r>
-              <w:t>???????</w:t>
+              <w:t>南北向直行放行</w:t>
             </w:r>
           </w:p>
         </w:tc>
@@ -433,7 +421,7 @@
           </w:tcPr>
           <w:p>
             <w:r>
-              <w:t>???????</w:t>
+              <w:t>东西向左转放行</w:t>
             </w:r>
           </w:p>
         </w:tc>
@@ -468,7 +456,7 @@
           </w:tcPr>
           <w:p>
             <w:r>
-              <w:t>???????</w:t>
+              <w:t>南北向左转放行</w:t>
             </w:r>
           </w:p>
         </w:tc>
@@ -487,11 +475,8 @@
     </w:tbl>
     <w:p/>
     <w:p>
-      <w:pPr>
-        <w:spacing w:after="120" w:line="276" w:lineRule="auto"/>
-      </w:pPr>
       <w:r>
-        <w:t>???????????????????? &lt;signal&gt;ETWT&lt;/signal&gt;?????????????????????????????????????????? T ???????????????????????????</w:t>
+        <w:t>模型输出必须被约束到明确的标签格式，例如 &lt;signal&gt;ETWT&lt;/signal&gt;。这样做的好处是便于后端严格解析、审计和回退；坏处是它天然适合标准四进口十字路口，对 T 字路口、五岔口、多相位交叉口和非对称车道不应直接套用。</w:t>
       </w:r>
     </w:p>
     <w:p>
@@ -499,15 +484,12 @@
         <w:pStyle w:val="Heading1"/>
       </w:pPr>
       <w:r>
-        <w:t>3. ???????? Traffic-R ??</w:t>
+        <w:t>3. 当前项目后端中的 Traffic-R 实现</w:t>
       </w:r>
     </w:p>
     <w:p>
-      <w:pPr>
-        <w:spacing w:after="120" w:line="276" w:lineRule="auto"/>
-      </w:pPr>
       <w:r>
-        <w:t>????????????Spring Boot ?? + ???????? + Python CityFlow ???????????? backend/src/main/java/com/traffic/strategy/rl/TrafficRBatchController.java?TrafficRAsyncDecisionService.java?CloudTrafficRClient.java??? cloud/traffic-r/traffic_r_service.py?</w:t>
+        <w:t>当前工程实现可以理解为“Spring Boot 编排 + 云端模型严格推理 + Python CityFlow 应用动作”。核心代码包括 TrafficRBatchController.java、TrafficRAsyncDecisionService.java、CloudTrafficRClient.java，以及 cloud/traffic-r/traffic_r_service.py。</w:t>
       </w:r>
     </w:p>
     <w:p>
@@ -515,7 +497,7 @@
         <w:pStyle w:val="Heading2"/>
       </w:pPr>
       <w:r>
-        <w:t>3.1 ??????</w:t>
+        <w:t>3.1 后端请求构造</w:t>
       </w:r>
     </w:p>
     <w:p>
@@ -523,7 +505,7 @@
         <w:pStyle w:val="ListNumber"/>
       </w:pPr>
       <w:r>
-        <w:t>SimulationService ????? sim.frame?StrategyDispatchService ??????? Traffic-R?</w:t>
+        <w:t>SimulationService 周期性获取 sim.frame，StrategyDispatchService 在决策周期触发 Traffic-R。</w:t>
       </w:r>
     </w:p>
     <w:p>
@@ -531,7 +513,7 @@
         <w:pStyle w:val="ListNumber"/>
       </w:pPr>
       <w:r>
-        <w:t>TrafficRBatchController ? frame.signals ????????????? frame.roads?frame.laneStates?frame.metrics ?? TrafficRObservation?</w:t>
+        <w:t>TrafficRBatchController 从 frame.signals 获取当前路口和当前相位，从 frame.roads、frame.laneStates、frame.metrics 构造 TrafficRObservation。</w:t>
       </w:r>
     </w:p>
     <w:p>
@@ -539,7 +521,7 @@
         <w:pStyle w:val="ListNumber"/>
       </w:pPr>
       <w:r>
-        <w:t>????? JinanPhaseMapper ??????????ETWT?NTST?ELWL?NLSL?</w:t>
+        <w:t>后端只保留 JinanPhaseMapper 识别的四个业务相位：ETWT、NTST、ELWL、NLSL。</w:t>
       </w:r>
     </w:p>
     <w:p>
@@ -547,7 +529,7 @@
         <w:pStyle w:val="ListNumber"/>
       </w:pPr>
       <w:r>
-        <w:t>?? TrafficRBatchPredictRequest??? sceneId?simTime?intersections?observation??? CloudTrafficRClient ???? /predict-batch?</w:t>
+        <w:t>构造 TrafficRBatchPredictRequest，包含 sceneId、simTime、intersections、observation，通过 CloudTrafficRClient 调用云端 /predict-batch。</w:t>
       </w:r>
     </w:p>
     <w:p>
@@ -555,7 +537,7 @@
         <w:pStyle w:val="Heading2"/>
       </w:pPr>
       <w:r>
-        <w:t>3.2 ??????</w:t>
+        <w:t>3.2 云端模型推理</w:t>
       </w:r>
     </w:p>
     <w:p>
@@ -563,7 +545,7 @@
         <w:pStyle w:val="ListNumber"/>
       </w:pPr>
       <w:r>
-        <w:t>cloud/traffic-r/traffic_r_service.py ?? BatchPredictRequest?</w:t>
+        <w:t>cloud/traffic-r/traffic_r_service.py 接收 BatchPredictRequest。</w:t>
       </w:r>
     </w:p>
     <w:p>
@@ -571,7 +553,7 @@
         <w:pStyle w:val="ListNumber"/>
       </w:pPr>
       <w:r>
-        <w:t>??????? build_prompt?? lane-level ??????? commonsense ???</w:t>
+        <w:t>对每个路口调用 build_prompt，把 lane-level 状态转换成官方 commonsense 表达。</w:t>
       </w:r>
     </w:p>
     <w:p>
@@ -579,7 +561,7 @@
         <w:pStyle w:val="ListNumber"/>
       </w:pPr>
       <w:r>
-        <w:t>?? tokenizer ? chat template ? fallback ?????? prompt?</w:t>
+        <w:t>使用 tokenizer 的 chat template 或 fallback 文本格式构造 prompt。</w:t>
       </w:r>
     </w:p>
     <w:p>
@@ -587,7 +569,7 @@
         <w:pStyle w:val="ListNumber"/>
       </w:pPr>
       <w:r>
-        <w:t>generate_batch ????? prompt ???????? temperature=0?do_sample=false????????</w:t>
+        <w:t>generate_batch 对多个路口 prompt 做批量推理，默认 temperature=0、do_sample=false，保证输出稳定。</w:t>
       </w:r>
     </w:p>
     <w:p>
@@ -595,7 +577,7 @@
         <w:pStyle w:val="ListNumber"/>
       </w:pPr>
       <w:r>
-        <w:t>parse_phase_code ??? &lt;signal&gt;ETWT|NTST|ELWL|NLSL&lt;/signal&gt;?????????????????? fallback ???</w:t>
+        <w:t>parse_phase_code 只接受 &lt;signal&gt;ETWT|NTST|ELWL|NLSL&lt;/signal&gt;。无法解析则整批请求视为无效，由后端 fallback 兜底。</w:t>
       </w:r>
     </w:p>
     <w:p>
@@ -603,7 +585,7 @@
         <w:pStyle w:val="Heading2"/>
       </w:pPr>
       <w:r>
-        <w:t>3.3 ?????????</w:t>
+        <w:t>3.3 后端结果解析与回退</w:t>
       </w:r>
     </w:p>
     <w:p>
@@ -611,7 +593,7 @@
         <w:pStyle w:val="ListNumber"/>
       </w:pPr>
       <w:r>
-        <w:t>TrafficRBatchController ?? response.decisions ???????????????</w:t>
+        <w:t>TrafficRBatchController 校验 response.decisions 数量是否覆盖当前所有信号路口。</w:t>
       </w:r>
     </w:p>
     <w:p>
@@ -619,7 +601,7 @@
         <w:pStyle w:val="ListNumber"/>
       </w:pPr>
       <w:r>
-        <w:t>?? TrafficRPredictResponse ?? parsedFromModel=true ? rawOutput ???</w:t>
+        <w:t>每个 TrafficRPredictResponse 必须 parsedFromModel=true 且 rawOutput 非空。</w:t>
       </w:r>
     </w:p>
     <w:p>
@@ -627,7 +609,7 @@
         <w:pStyle w:val="ListNumber"/>
       </w:pPr>
       <w:r>
-        <w:t>?? phaseCode ????? phaseIndex??? JinanPhaseMapper ??? CityFlow phaseIndex?</w:t>
+        <w:t>模型 phaseCode 转换为业务 phaseIndex，再由 JinanPhaseMapper 转换为 CityFlow phaseIndex。</w:t>
       </w:r>
     </w:p>
     <w:p>
@@ -635,7 +617,7 @@
         <w:pStyle w:val="ListNumber"/>
       </w:pPr>
       <w:r>
-        <w:t>???? ControlDecision?metadata ??? modelPhaseCode?rawOutput?inferenceTimeSec?fallback ????????</w:t>
+        <w:t>最终生成 ControlDecision，metadata 中记录 modelPhaseCode、rawOutput、inferenceTimeSec、fallback 状态等审计信息。</w:t>
       </w:r>
     </w:p>
     <w:p>
@@ -643,7 +625,7 @@
         <w:pStyle w:val="ListNumber"/>
       </w:pPr>
       <w:r>
-        <w:t>TrafficRAsyncDecisionService ????????????????????????? 3 ?????? MaxPressure fallback??? 3 ?????? Traffic-R?</w:t>
+        <w:t>TrafficRAsyncDecisionService 异步调度模型请求：推理未返回时继续推送实时帧；连续 3 次失败后启用 MaxPressure fallback，连续 3 次成功后恢复 Traffic-R。</w:t>
       </w:r>
     </w:p>
     <w:p>
@@ -687,7 +669,7 @@
         <w:jc w:val="center"/>
       </w:pPr>
       <w:r>
-        <w:t>? 1 ???? Traffic-R ????? fallback ??</w:t>
+        <w:t>图 1 当前项目 Traffic-R 在线推理与 fallback 链路</w:t>
       </w:r>
     </w:p>
     <w:p>
@@ -695,15 +677,12 @@
         <w:pStyle w:val="Heading1"/>
       </w:pPr>
       <w:r>
-        <w:t>4. ???????????? Traffic-R</w:t>
+        <w:t>4. 为什么扩大路网时不能只用 Traffic-R</w:t>
       </w:r>
     </w:p>
     <w:p>
-      <w:pPr>
-        <w:spacing w:after="120" w:line="276" w:lineRule="auto"/>
-      </w:pPr>
       <w:r>
-        <w:t>Traffic-R1 ????? RL ????????????????????????????????????? Traffic-R ?????????? prompt ??????????????????????????? Traffic-R ????????????????????????????????????</w:t>
+        <w:t>Traffic-R1 具有比传统 RL 更好的泛化潜力，但“有泛化性”不等于“所有路口都适合直接控制”。当前项目的 Traffic-R 在线接口、相位映射和 prompt 都是围绕标准四进口十字路口构造的。因此，扩大路网时应把 Traffic-R 用在它最擅长的标准核心区域，把复杂路口和区域边界交给更稳健的工程控制器。</w:t>
       </w:r>
     </w:p>
     <w:tbl>
@@ -723,60 +702,60 @@
         <w:tc>
           <w:tcPr>
             <w:tcW w:type="dxa" w:w="1584"/>
+            <w:shd w:fill="E8EEF5"/>
             <w:vAlign w:val="center"/>
-            <w:shd w:fill="E8EEF5"/>
           </w:tcPr>
           <w:p>
             <w:r>
               <w:rPr>
                 <w:b/>
               </w:rPr>
-              <w:t>???</w:t>
+              <w:t>控制器</w:t>
             </w:r>
           </w:p>
         </w:tc>
         <w:tc>
           <w:tcPr>
             <w:tcW w:type="dxa" w:w="2448"/>
+            <w:shd w:fill="E8EEF5"/>
             <w:vAlign w:val="center"/>
-            <w:shd w:fill="E8EEF5"/>
           </w:tcPr>
           <w:p>
             <w:r>
               <w:rPr>
                 <w:b/>
               </w:rPr>
-              <w:t>????</w:t>
+              <w:t>适合区域</w:t>
             </w:r>
           </w:p>
         </w:tc>
         <w:tc>
           <w:tcPr>
             <w:tcW w:type="dxa" w:w="3456"/>
+            <w:shd w:fill="E8EEF5"/>
             <w:vAlign w:val="center"/>
-            <w:shd w:fill="E8EEF5"/>
           </w:tcPr>
           <w:p>
             <w:r>
               <w:rPr>
                 <w:b/>
               </w:rPr>
-              <w:t>??</w:t>
+              <w:t>原因</w:t>
             </w:r>
           </w:p>
         </w:tc>
         <w:tc>
           <w:tcPr>
             <w:tcW w:type="dxa" w:w="2592"/>
+            <w:shd w:fill="E8EEF5"/>
             <w:vAlign w:val="center"/>
-            <w:shd w:fill="E8EEF5"/>
           </w:tcPr>
           <w:p>
             <w:r>
               <w:rPr>
                 <w:b/>
               </w:rPr>
-              <w:t>?????</w:t>
+              <w:t>不适合情况</w:t>
             </w:r>
           </w:p>
         </w:tc>
@@ -800,7 +779,7 @@
           </w:tcPr>
           <w:p>
             <w:r>
-              <w:t>???????????????????</w:t>
+              <w:t>标准四进口、四相位、结构连续的核心区域</w:t>
             </w:r>
           </w:p>
         </w:tc>
@@ -811,7 +790,7 @@
           </w:tcPr>
           <w:p>
             <w:r>
-              <w:t>?? LLM ????????? lane-level ??/???????????????</w:t>
+              <w:t>利用 LLM 交通推理能力，适合 lane-level 排队/接近车辆信息充分的标准十字路口</w:t>
             </w:r>
           </w:p>
         </w:tc>
@@ -822,7 +801,7 @@
           </w:tcPr>
           <w:p>
             <w:r>
-              <w:t>T ?????????????????????</w:t>
+              <w:t>T 字路口、多岔口、多相位、相位编码不一致路口</w:t>
             </w:r>
           </w:p>
         </w:tc>
@@ -846,7 +825,7 @@
           </w:tcPr>
           <w:p>
             <w:r>
-              <w:t>????????????Traffic-R ?? fallback</w:t>
+              <w:t>复杂路口、边界缓冲路口、Traffic-R 失败 fallback</w:t>
             </w:r>
           </w:p>
         </w:tc>
@@ -857,7 +836,7 @@
           </w:tcPr>
           <w:p>
             <w:r>
-              <w:t>?????????????????????????</w:t>
+              <w:t>天然考虑上下游压力，能缓解上游放行但下游阻塞的问题</w:t>
             </w:r>
           </w:p>
         </w:tc>
@@ -868,7 +847,7 @@
           </w:tcPr>
           <w:p>
             <w:r>
-              <w:t>????????????????</w:t>
+              <w:t>低流量外围路口上可能过度频繁调节</w:t>
             </w:r>
           </w:p>
         </w:tc>
@@ -892,7 +871,7 @@
           </w:tcPr>
           <w:p>
             <w:r>
-              <w:t>???????????????</w:t>
+              <w:t>最外围低流量、稳定需求高的路口</w:t>
             </w:r>
           </w:p>
         </w:tc>
@@ -903,7 +882,7 @@
           </w:tcPr>
           <w:p>
             <w:r>
-              <w:t>???????????????????????</w:t>
+              <w:t>实现简单、稳定、成本低，可作为基线和低风险控制</w:t>
             </w:r>
           </w:p>
         </w:tc>
@@ -914,7 +893,7 @@
           </w:tcPr>
           <w:p>
             <w:r>
-              <w:t>???????????????????</w:t>
+              <w:t>高波动、高拥堵、需要协调优化的核心区域</w:t>
             </w:r>
           </w:p>
         </w:tc>
@@ -926,15 +905,12 @@
         <w:pStyle w:val="Heading1"/>
       </w:pPr>
       <w:r>
-        <w:t>5. ??????????</w:t>
+        <w:t>5. 复杂路网混合控制方案</w:t>
       </w:r>
     </w:p>
     <w:p>
-      <w:pPr>
-        <w:spacing w:after="120" w:line="276" w:lineRule="auto"/>
-      </w:pPr>
       <w:r>
-        <w:t>?????????????????????Traffic-R ?????????Max-Pressure ??????????????Fixed-Time ??????????????????? Traffic-R ????????????????????????????????????????</w:t>
+        <w:t>短期实现目标是将大路网划分为三个控制层级：Traffic-R 控制标准核心区域，Max-Pressure 控制复杂区域和边界缓冲路口，Fixed-Time 控制最外围低流量路口。核心思想是：只让 Traffic-R 在“兼容且内部连续”的区域发挥泛化能力，不让它直接承担结构不匹配或边界外溢风险。</w:t>
       </w:r>
     </w:p>
     <w:p>
@@ -942,7 +918,7 @@
         <w:pStyle w:val="Heading2"/>
       </w:pPr>
       <w:r>
-        <w:t>5.1 ??????</w:t>
+        <w:t>5.1 区域划分规则</w:t>
       </w:r>
     </w:p>
     <w:p>
@@ -950,7 +926,7 @@
         <w:pStyle w:val="ListNumber"/>
       </w:pPr>
       <w:r>
-        <w:t>????????????????????????roadLink?laneLink?????????? movement?</w:t>
+        <w:t>扫描所有非虚拟路口，读取进口道路数、出口道路数、roadLink、laneLink、相位数量、相位放行 movement。</w:t>
       </w:r>
     </w:p>
     <w:p>
@@ -958,7 +934,7 @@
         <w:pStyle w:val="ListNumber"/>
       </w:pPr>
       <w:r>
-        <w:t>?? Traffic-R compatible????????????????????????????????/?? movement?????????? ETWT?NTST?ELWL?NLSL???????? WT/WL/ST/SL/ET/EL/NT/NL ?? movement lane?</w:t>
+        <w:t>判断 Traffic-R compatible：标准四进口十字路口；含东西南北四个方向；每个方向至少可映射直行/左转 movement；候选相位可归一化为 ETWT、NTST、ELWL、NLSL；车道状态可形成 WT/WL/ST/SL/ET/EL/NT/NL 八类 movement lane。</w:t>
       </w:r>
     </w:p>
     <w:p>
@@ -966,7 +942,7 @@
         <w:pStyle w:val="ListNumber"/>
       </w:pPr>
       <w:r>
-        <w:t>? compatible ???????????????????? compatible ?????????????</w:t>
+        <w:t>在 compatible 路口构成的子图上找连通块。图的边表示两个 compatible 路口之间存在有效道路连接。</w:t>
       </w:r>
     </w:p>
     <w:p>
@@ -974,7 +950,7 @@
         <w:pStyle w:val="ListNumber"/>
       </w:pPr>
       <w:r>
-        <w:t>???????????????????????????????????? Traffic-R ?????</w:t>
+        <w:t>过滤小连通块。只有路口数量、面积、主干道连续性达到阈值的连通块才允许成为 Traffic-R 候选区域。</w:t>
       </w:r>
     </w:p>
     <w:p>
@@ -982,7 +958,7 @@
         <w:pStyle w:val="ListNumber"/>
       </w:pPr>
       <w:r>
-        <w:t>?????????????????????? compatible ????? compatible ????? boundary?</w:t>
+        <w:t>对保留连通块做边界降级：连通块外圈一跳或与非 compatible 路口相邻的 compatible 节点标记为 boundary。</w:t>
       </w:r>
     </w:p>
     <w:p>
@@ -990,7 +966,7 @@
         <w:pStyle w:val="ListNumber"/>
       </w:pPr>
       <w:r>
-        <w:t>???????core ?????? Traffic-R?boundary ??????? Max-Pressure?????????????? Fixed-Time?</w:t>
+        <w:t>最终分配策略：core 内部路口使用 Traffic-R；boundary 与复杂路口使用 Max-Pressure；外围低流量且稳定的路口使用 Fixed-Time。</w:t>
       </w:r>
     </w:p>
     <w:p>
@@ -1034,7 +1010,7 @@
         <w:jc w:val="center"/>
       </w:pPr>
       <w:r>
-        <w:t>? 2 ???????????????</w:t>
+        <w:t>图 2 复杂路网区域划分与混合控制示意</w:t>
       </w:r>
     </w:p>
     <w:p>
@@ -1042,15 +1018,12 @@
         <w:pStyle w:val="Heading2"/>
       </w:pPr>
       <w:r>
-        <w:t>5.2 ????</w:t>
+        <w:t>5.2 示例解释</w:t>
       </w:r>
     </w:p>
     <w:p>
-      <w:pPr>
-        <w:spacing w:after="120" w:line="276" w:lineRule="auto"/>
-      </w:pPr>
       <w:r>
-        <w:t>??????????????? compatible ???????????? Traffic-R ??????????????? Traffic-R????????????????????????????????????????????????????????????????????? T ?? Traffic-R core??? B ?? MaxPressure ???????</w:t>
+        <w:t>用户给出的示例可以解释为：原始 compatible 图中左上大部分节点都满足 Traffic-R 的结构要求，但最终不能全部交给 Traffic-R。因为连通块边缘直接接触非兼容区域或网络边界，边缘路口的放行会影响外部复杂区域，容易形成“上游放行、下游堵死”的外溢风险。因此，只保留内部 T 作为 Traffic-R core，外圈 B 交给 MaxPressure 作为边界缓冲。</w:t>
       </w:r>
     </w:p>
     <w:tbl>
@@ -1069,45 +1042,45 @@
         <w:tc>
           <w:tcPr>
             <w:tcW w:type="dxa" w:w="1008"/>
+            <w:shd w:fill="E8EEF5"/>
             <w:vAlign w:val="center"/>
-            <w:shd w:fill="E8EEF5"/>
           </w:tcPr>
           <w:p>
             <w:r>
               <w:rPr>
                 <w:b/>
               </w:rPr>
-              <w:t>??</w:t>
+              <w:t>符号</w:t>
             </w:r>
           </w:p>
         </w:tc>
         <w:tc>
           <w:tcPr>
             <w:tcW w:type="dxa" w:w="2160"/>
+            <w:shd w:fill="E8EEF5"/>
             <w:vAlign w:val="center"/>
-            <w:shd w:fill="E8EEF5"/>
           </w:tcPr>
           <w:p>
             <w:r>
               <w:rPr>
                 <w:b/>
               </w:rPr>
-              <w:t>????</w:t>
+              <w:t>控制策略</w:t>
             </w:r>
           </w:p>
         </w:tc>
         <w:tc>
           <w:tcPr>
             <w:tcW w:type="dxa" w:w="6192"/>
+            <w:shd w:fill="E8EEF5"/>
             <w:vAlign w:val="center"/>
-            <w:shd w:fill="E8EEF5"/>
           </w:tcPr>
           <w:p>
             <w:r>
               <w:rPr>
                 <w:b/>
               </w:rPr>
-              <w:t>??</w:t>
+              <w:t>说明</w:t>
             </w:r>
           </w:p>
         </w:tc>
@@ -1142,7 +1115,7 @@
           </w:tcPr>
           <w:p>
             <w:r>
-              <w:t>??????????????????????? Traffic-R prompt ????</w:t>
+              <w:t>位于大连通块内部，标准四进口四相位，输入输出与 Traffic-R prompt 完全匹配</w:t>
             </w:r>
           </w:p>
         </w:tc>
@@ -1177,7 +1150,7 @@
           </w:tcPr>
           <w:p>
             <w:r>
-              <w:t>??????????????????????????????</w:t>
+              <w:t>兼容路口的外圈缓冲层，负责吸收核心区与复杂区之间的上下游压力</w:t>
             </w:r>
           </w:p>
         </w:tc>
@@ -1212,7 +1185,7 @@
           </w:tcPr>
           <w:p>
             <w:r>
-              <w:t>T ?????????????????????</w:t>
+              <w:t>T 字路口、多相位、非对称车道或连接复杂的路口</w:t>
             </w:r>
           </w:p>
         </w:tc>
@@ -1247,7 +1220,7 @@
           </w:tcPr>
           <w:p>
             <w:r>
-              <w:t>??????????????????????</w:t>
+              <w:t>外围低流量、交通状态稳定、策略收益不高的路口</w:t>
             </w:r>
           </w:p>
         </w:tc>
@@ -1259,27 +1232,23 @@
         <w:pStyle w:val="Heading1"/>
       </w:pPr>
       <w:r>
-        <w:t>6. ????????</w:t>
+        <w:t>6. 可落地的算法逻辑</w:t>
       </w:r>
     </w:p>
     <w:p>
-      <w:pPr>
-        <w:spacing w:after="120" w:line="276" w:lineRule="auto"/>
-      </w:pPr>
       <w:r>
-        <w:t>??????????????????????????? strategy.region ? roadnet.service ????? roadnet ????????? intersectionId ? controllerType?</w:t>
+        <w:t>下面给出一个后端可实现的区域划分伪代码。实际代码可放在 strategy.region 或 roadnet.service 下，由场景 roadnet 加载完成后生成每个 intersectionId 的 controllerType。</w:t>
       </w:r>
     </w:p>
     <w:p>
-      <w:pPr/>
       <w:r>
         <w:rPr>
-          <w:rFonts w:ascii="Consolas" w:hAnsi="Consolas" w:eastAsia="Consolas"/>
+          <w:rFonts w:ascii="Consolas" w:hAnsi="Consolas" w:eastAsia="Microsoft YaHei"/>
           <w:sz w:val="18"/>
         </w:rPr>
-        <w:t>???roadnet, laneStatesSchema, minCoreSize, boundaryHop=1</w:t>
+        <w:t>输入：roadnet, laneStatesSchema, minCoreSize, boundaryHop=1</w:t>
         <w:br/>
-        <w:t>???controllerAssignment: intersectionId -&gt; {traffic-r, max-pressure, fixed-time}</w:t>
+        <w:t>输出：controllerAssignment: intersectionId -&gt; {traffic-r, max-pressure, fixed-time}</w:t>
         <w:br/>
         <w:br/>
         <w:t>1. compatible = {}</w:t>
@@ -1289,7 +1258,6 @@
         <w:t xml:space="preserve">       if isVirtual(intersection): continue</w:t>
         <w:br/>
         <w:t xml:space="preserve">       compatible[i] = isTrafficRCompatible(intersection)</w:t>
-        <w:br/>
         <w:br/>
         <w:t>3. G_T = subgraph(roadnet.graph, nodes where compatible=true)</w:t>
         <w:br/>
@@ -1303,32 +1271,21 @@
         <w:br/>
         <w:t xml:space="preserve">           trafficRBlocks.add(comp)</w:t>
         <w:br/>
-        <w:br/>
         <w:t>7. core = union(trafficRBlocks)</w:t>
         <w:br/>
         <w:t>8. boundary = nodesWithinHop(core, boundaryHop) that touch nonCore or nonCompatible</w:t>
         <w:br/>
         <w:t>9. core = core - boundary</w:t>
         <w:br/>
-        <w:br/>
         <w:t>10. for each intersection:</w:t>
         <w:br/>
-        <w:t xml:space="preserve">        if intersection in core:</w:t>
+        <w:t xml:space="preserve">        if intersection in core: controller = traffic-r</w:t>
         <w:br/>
-        <w:t xml:space="preserve">            controller = traffic-r</w:t>
+        <w:t xml:space="preserve">        else if isComplex(intersection) or intersection in boundary: controller = max-pressure</w:t>
         <w:br/>
-        <w:t xml:space="preserve">        else if isComplex(intersection) or intersection in boundary:</w:t>
+        <w:t xml:space="preserve">        else if isLowFlowPeripheral(intersection): controller = fixed-time</w:t>
         <w:br/>
-        <w:t xml:space="preserve">            controller = max-pressure</w:t>
-        <w:br/>
-        <w:t xml:space="preserve">        else if isLowFlowPeripheral(intersection):</w:t>
-        <w:br/>
-        <w:t xml:space="preserve">            controller = fixed-time</w:t>
-        <w:br/>
-        <w:t xml:space="preserve">        else:</w:t>
-        <w:br/>
-        <w:t xml:space="preserve">            controller = max-pressure</w:t>
-        <w:br/>
+        <w:t xml:space="preserve">        else: controller = max-pressure</w:t>
         <w:br/>
         <w:t>11. return controllerAssignment</w:t>
       </w:r>
@@ -1338,7 +1295,7 @@
         <w:pStyle w:val="Heading1"/>
       </w:pPr>
       <w:r>
-        <w:t>7. ????????????</w:t>
+        <w:t>7. 与当前后端架构的集成建议</w:t>
       </w:r>
     </w:p>
     <w:p>
@@ -1346,7 +1303,7 @@
         <w:pStyle w:val="ListNumber"/>
       </w:pPr>
       <w:r>
-        <w:t>?? RegionControllerAssignmentService??? scene roadnet??? intersectionId ? controllerType ????</w:t>
+        <w:t>新增 RegionControllerAssignmentService：输入 scene roadnet，输出 intersectionId 到 controllerType 的映射。</w:t>
       </w:r>
     </w:p>
     <w:p>
@@ -1354,7 +1311,7 @@
         <w:pStyle w:val="ListNumber"/>
       </w:pPr>
       <w:r>
-        <w:t>????????? controllerType ??? mode=hybrid ? controllerPolicyId?</w:t>
+        <w:t>创建仿真会话时，除 controllerType 外增加 mode=hybrid 或 controllerPolicyId。</w:t>
       </w:r>
     </w:p>
     <w:p>
@@ -1362,7 +1319,7 @@
         <w:pStyle w:val="ListNumber"/>
       </w:pPr>
       <w:r>
-        <w:t>StrategyDispatchService ??????? ControlRequest ??????????Traffic-R core ?? TrafficRAsyncDecisionService?MaxPressure ????? MaxPressureController?Fixed-Time ??? FixedTimeController?</w:t>
+        <w:t>StrategyDispatchService 在生成每个路口 ControlRequest 前查询区域分配结果：Traffic-R core 进入 TrafficRAsyncDecisionService；MaxPressure 区域直接走 MaxPressureController；Fixed-Time 区域走 FixedTimeController。</w:t>
       </w:r>
     </w:p>
     <w:p>
@@ -1370,7 +1327,7 @@
         <w:pStyle w:val="ListNumber"/>
       </w:pPr>
       <w:r>
-        <w:t>Traffic-R /predict-batch ????? core ?????????????????????</w:t>
+        <w:t>Traffic-R /predict-batch 请求只包含 core 内部路口，避免模型看到无法解析的复杂路口。</w:t>
       </w:r>
     </w:p>
     <w:p>
@@ -1378,7 +1335,7 @@
         <w:pStyle w:val="ListNumber"/>
       </w:pPr>
       <w:r>
-        <w:t>MaxPressure boundary ?? decisionIntervalSec ???????????????????????????</w:t>
+        <w:t>MaxPressure boundary 每个 decisionIntervalSec 周期更新，优先考虑下游排队，防止核心区出流冲击复杂区。</w:t>
       </w:r>
     </w:p>
     <w:p>
@@ -1386,7 +1343,7 @@
         <w:pStyle w:val="ListNumber"/>
       </w:pPr>
       <w:r>
-        <w:t>??????????? ControlDecision???? SafetyLayerService ? CityFlowClient.applyControlActions ???</w:t>
+        <w:t>所有控制器输出仍统一为 ControlDecision，再经过 SafetyLayerService 和 CityFlowClient.applyControlActions 下发。</w:t>
       </w:r>
     </w:p>
     <w:p>
@@ -1394,7 +1351,7 @@
         <w:pStyle w:val="Heading1"/>
       </w:pPr>
       <w:r>
-        <w:t>8. ?????????</w:t>
+        <w:t>8. 验收指标与风险控制</w:t>
       </w:r>
     </w:p>
     <w:tbl>
@@ -1412,30 +1369,30 @@
         <w:tc>
           <w:tcPr>
             <w:tcW w:type="dxa" w:w="2448"/>
+            <w:shd w:fill="E8EEF5"/>
             <w:vAlign w:val="center"/>
-            <w:shd w:fill="E8EEF5"/>
           </w:tcPr>
           <w:p>
             <w:r>
               <w:rPr>
                 <w:b/>
               </w:rPr>
-              <w:t>???</w:t>
+              <w:t>检查项</w:t>
             </w:r>
           </w:p>
         </w:tc>
         <w:tc>
           <w:tcPr>
             <w:tcW w:type="dxa" w:w="6912"/>
+            <w:shd w:fill="E8EEF5"/>
             <w:vAlign w:val="center"/>
-            <w:shd w:fill="E8EEF5"/>
           </w:tcPr>
           <w:p>
             <w:r>
               <w:rPr>
                 <w:b/>
               </w:rPr>
-              <w:t>??????</w:t>
+              <w:t>建议验收方式</w:t>
             </w:r>
           </w:p>
         </w:tc>
@@ -1448,7 +1405,7 @@
           </w:tcPr>
           <w:p>
             <w:r>
-              <w:t>??????</w:t>
+              <w:t>兼容性正确性</w:t>
             </w:r>
           </w:p>
         </w:tc>
@@ -1459,7 +1416,7 @@
           </w:tcPr>
           <w:p>
             <w:r>
-              <w:t>???? Traffic-R core ??????????????? ETWT/NTST/ELWL/NLSL</w:t>
+              <w:t>抽样检查 Traffic-R core 内所有路口是否均可映射为四相位 ETWT/NTST/ELWL/NLSL</w:t>
             </w:r>
           </w:p>
         </w:tc>
@@ -1472,7 +1429,7 @@
           </w:tcPr>
           <w:p>
             <w:r>
-              <w:t>?????</w:t>
+              <w:t>边界安全性</w:t>
             </w:r>
           </w:p>
         </w:tc>
@@ -1483,7 +1440,7 @@
           </w:tcPr>
           <w:p>
             <w:r>
-              <w:t>?? Traffic-R core ???? MaxPressure ????????????????</w:t>
+              <w:t>确认 Traffic-R core 外圈均由 MaxPressure 接管，且不会直接连接未受控复杂区</w:t>
             </w:r>
           </w:p>
         </w:tc>
@@ -1496,7 +1453,7 @@
           </w:tcPr>
           <w:p>
             <w:r>
-              <w:t>?????</w:t>
+              <w:t>模型有效性</w:t>
             </w:r>
           </w:p>
         </w:tc>
@@ -1507,7 +1464,7 @@
           </w:tcPr>
           <w:p>
             <w:r>
-              <w:t>?? hybrid?pure MaxPressure?Fixed-Time ??????????????????</w:t>
+              <w:t>比较 hybrid、pure MaxPressure、Fixed-Time 三组策略的平均等待、排队长度、通行量</w:t>
             </w:r>
           </w:p>
         </w:tc>
@@ -1520,7 +1477,7 @@
           </w:tcPr>
           <w:p>
             <w:r>
-              <w:t>fallback ???</w:t>
+              <w:t>fallback 稳定性</w:t>
             </w:r>
           </w:p>
         </w:tc>
@@ -1531,7 +1488,7 @@
           </w:tcPr>
           <w:p>
             <w:r>
-              <w:t>?? Traffic-R ??/??????? 3 ?????? MaxPressure?3 ??????</w:t>
+              <w:t>模拟 Traffic-R 超时/无效输出，确认 3 次失败后进入 MaxPressure，3 次成功后恢复</w:t>
             </w:r>
           </w:p>
         </w:tc>
@@ -1544,7 +1501,7 @@
           </w:tcPr>
           <w:p>
             <w:r>
-              <w:t>??????</w:t>
+              <w:t>可视化一致性</w:t>
             </w:r>
           </w:p>
         </w:tc>
@@ -1555,7 +1512,7 @@
           </w:tcPr>
           <w:p>
             <w:r>
-              <w:t>???????? sim.frame.data.signals??????????????</w:t>
+              <w:t>前端信号灯只读取 sim.frame.data.signals，不使用模型输出伪造视觉状态</w:t>
             </w:r>
           </w:p>
         </w:tc>
@@ -1567,7 +1524,7 @@
         <w:pStyle w:val="Heading1"/>
       </w:pPr>
       <w:r>
-        <w:t>9. ?????????</w:t>
+        <w:t>9. 资料来源与代码依据</w:t>
       </w:r>
     </w:p>
     <w:p>
@@ -1575,7 +1532,7 @@
         <w:pStyle w:val="ListBullet"/>
       </w:pPr>
       <w:r>
-        <w:t>Traffic-R1 ?????Traffic-R1: Two-Stage Reinforcement Learning for Traffic Signal Control with Large Language Models?arXiv:2508.02344?</w:t>
+        <w:t>Traffic-R1 官方论文：Traffic-R1: Two-Stage Reinforcement Learning for Traffic Signal Control with Large Language Models，arXiv:2508.02344。</w:t>
       </w:r>
     </w:p>
     <w:p>
@@ -1583,7 +1540,7 @@
         <w:pStyle w:val="ListBullet"/>
       </w:pPr>
       <w:r>
-        <w:t>Traffic-R1 ????Hugging Face Season998/Traffic-R1?</w:t>
+        <w:t>Traffic-R1 模型页：Hugging Face Season998/Traffic-R1。</w:t>
       </w:r>
     </w:p>
     <w:p>
@@ -1591,7 +1548,7 @@
         <w:pStyle w:val="ListBullet"/>
       </w:pPr>
       <w:r>
-        <w:t>?????????TrafficRBatchController.java?TrafficRAsyncDecisionService.java?CloudTrafficRClient.java?cloud/traffic-r/traffic_r_service.py?</w:t>
+        <w:t>当前项目代码依据：TrafficRBatchController.java、TrafficRAsyncDecisionService.java、CloudTrafficRClient.java、cloud/traffic-r/traffic_r_service.py。</w:t>
       </w:r>
     </w:p>
     <w:p>
@@ -1599,7 +1556,7 @@
         <w:pStyle w:val="ListBullet"/>
       </w:pPr>
       <w:r>
-        <w:t>????????????backend/docs/TECHNICAL_DESIGN.md?backend/docs/CALL_CHAIN.md?docs/CFRP-1.0-???????.md?</w:t>
+        <w:t>当前项目通信与调度依据：backend/docs/TECHNICAL_DESIGN.md、backend/docs/CALL_CHAIN.md、docs/CFRP-1.0-前后端通信协议.md。</w:t>
       </w:r>
     </w:p>
     <w:sectPr>

</xml_diff>